<commit_message>
Cycle 2: second adversarial review, consistency audit, readiness report (decision B), updated register and review notes
Co-Authored-By: Claude Sonnet 5.5 <noreply@anthropic.com>
Claude-Session: https://claude.ai/code/session_01QHzkZ7jvqQ7qpsTaxao7k1
</commit_message>
<xml_diff>
--- a/reinforced/manuscript/Revised_Manuscript.docx
+++ b/reinforced/manuscript/Revised_Manuscript.docx
@@ -58,7 +58,7 @@
           <w:b w:val="0"/>
           <w:i w:val="0"/>
         </w:rPr>
-        <w:t>Methods: We used publisher-deposited received and accepted dates for 1,737,272 research articles in 800 Springer Nature, Wiley and Taylor &amp; Francis journals (781 evaluable). At forecast origins in January 2023 and January 2024, and in a rolling quarterly panel, forecasts built only from papers already visible were scored against the 298,469 papers submitted in the following six months. Inference used journal-cluster bootstraps with imprint- and publisher-level checks. The received date was checked against preprint posting dates, and miscalibration was examined with null simulations.</w:t>
+        <w:t>Methods: We used publisher-deposited received and accepted dates for 1,737,272 research articles in 800 Springer Nature, Wiley and Taylor &amp; Francis journals (781 evaluable). At forecast origins in January 2023 and January 2024, and in a rolling quarterly panel, forecasts built only from papers already visible were scored against the 298,469 papers submitted in the following six months. Inference used journal-cluster bootstraps with imprint- and publisher-level checks. The received date was checked against preprint posting dates; miscalibration was examined by simulation.</w:t>
       </w:r>
     </w:p>
     <w:p>
@@ -70,7 +70,7 @@
           <w:b w:val="0"/>
           <w:i w:val="0"/>
         </w:rPr>
-        <w:t>Results: Journal identity explained 26.5% (95% CI 24.7%–28.3%) of the variance of log acceptance time. Journal-specific forecasts lowered loss by 15.7% relative to publisher-pooled forecasts, but 80% intervals spanned about five-fold in days and covered 77.0% of later papers (journal average; imprint-level interval for the shortfall −4.2 to −1.1 points). The shortfall was absent under random splitting and in a stationary simulation, but random cohort-level shifts of the size of the journal × year variance reproduced its order of magnitude (−2.8 to −4.9 points). Lognormal, shrinkage and learned forecasters did not beat empirical quantiles. Recalibration and width inflation learned strictly from earlier cohorts over-corrected (+1.9 and +1.1 points). 12.0% of journal-origins accepted at least half of their papers within 72 days and 1.6% at least 80%; forecast probabilities for this event were too extreme (reliability slope 0.91). In Springer Nature journals with Research Square preprints, 95% of received dates were no later than 14 days after the preprint was posted (journal-weighted 82%), compatible with the received date being the submission date; other publishers' dates could not be tested.</w:t>
+        <w:t>Results: Journal identity explained 26.5% (95% CI 24.7%–28.3%) of the variance of log acceptance time. Journal-specific forecasts lowered loss by 15.7% relative to publisher-pooled forecasts, but 80% intervals spanned about five-fold in days and covered 77.0% of later papers (journal average; imprint-level interval for the shortfall −4.2 to −1.1 points). The shortfall was absent under random splitting and in a stationary simulation, but random cohort-level shifts of the size of the journal × year variance reproduced its order of magnitude (−2.8 to −4.9 points). Lognormal, shrinkage and learned forecasters did not beat empirical quantiles. Recalibration and width inflation learned from earlier cohorts over-corrected (+1.9 and +1.1 points). 12.0% of journal-origins accepted at least half of their papers within 72 days and 1.6% at least 80%; forecast probabilities for this event were too extreme (reliability slope 0.91). In Springer Nature journals with Research Square preprints, 95% of received dates were no later than 14 days after the preprint was posted (journal-weighted 82%), compatible with the received date being the submission date; other publishers' dates could not be tested.</w:t>
       </w:r>
     </w:p>
     <w:p>
@@ -82,7 +82,7 @@
           <w:b w:val="0"/>
           <w:i w:val="0"/>
         </w:rPr>
-        <w:t>Conclusions: A journal's last year of acceptance times is a useful but wide and slightly over-confident forecast, and simple empirical quantiles are hard to beat. Reports of editorial-process statistics should give quantiles, cohort definitions and uncertainty, and 'within X days' claims should not be read as guarantees. Findings are conditional on acceptance, on three publishers (the effective number of independent clusters) and on publisher-defined dates.</w:t>
+        <w:t>Conclusions: A journal's last year of acceptance times is a useful but wide and slightly over-confident forecast, and simple empirical quantiles are hard to beat. Turnaround statistics should be reported as quantiles for explicit cohorts with uncertainty, not read as guarantees. Findings are conditional on acceptance, on three publishers and on publisher-defined dates.</w:t>
       </w:r>
     </w:p>
     <w:p>
@@ -4916,7 +4916,7 @@
               <w:rPr>
                 <w:sz w:val="16"/>
               </w:rPr>
-              <w:t>Supported</w:t>
+              <w:t>Supported (L trained on one or two cohorts, untuned: weak test)</w:t>
             </w:r>
           </w:p>
         </w:tc>
@@ -5038,7 +5038,7 @@
         <w:spacing w:after="60"/>
       </w:pPr>
       <w:r>
-        <w:t>Article types and batches: durations mix article types and fast lanes; our variants reduce but do not remove this, and article type is not observed.</w:t>
+        <w:t>Learned forecaster: L was trained on one cohort (two for the 2025 origin), without tuning, so its failure to beat F0 is weak evidence about learned forecasters in general. Article types and batches: durations mix article types and fast lanes; our variants reduce but do not remove this, and article type is not observed.</w:t>
       </w:r>
     </w:p>
     <w:p>

</xml_diff>

<commit_message>
Cycle 2: apply third-check corrections (imprint-mean centring, softened causal wording, H5/H7 verdicts, remedy narrative)
Co-Authored-By: Claude Sonnet 5.5 <noreply@anthropic.com>
Claude-Session: https://claude.ai/code/session_01QHzkZ7jvqQ7qpsTaxao7k1
</commit_message>
<xml_diff>
--- a/reinforced/manuscript/Revised_Manuscript.docx
+++ b/reinforced/manuscript/Revised_Manuscript.docx
@@ -58,7 +58,7 @@
           <w:b w:val="0"/>
           <w:i w:val="0"/>
         </w:rPr>
-        <w:t>Methods: We used publisher-deposited received and accepted dates for 1,737,272 research articles in 800 Springer Nature, Wiley and Taylor &amp; Francis journals (781 evaluable). At forecast origins in January 2023 and January 2024, and in a rolling quarterly panel, forecasts built only from papers already visible were scored against the 298,469 papers submitted in the following six months. Inference used journal-cluster bootstraps with imprint- and publisher-level checks. The received date was checked against preprint posting dates; miscalibration was examined by simulation.</w:t>
+        <w:t>Methods: We used publisher-deposited received and accepted dates for 1,737,272 articles in 800 Springer Nature, Wiley and Taylor &amp; Francis journals (781 evaluable). At forecast origins in January 2023 and January 2024, and in a rolling quarterly panel, forecasts built only from papers already visible were scored against the 298,469 papers submitted in the following six months. Inference used journal-cluster bootstraps with imprint- and publisher-level checks. The received date was checked against preprint posting dates; miscalibration was examined by simulation.</w:t>
       </w:r>
     </w:p>
     <w:p>
@@ -70,7 +70,7 @@
           <w:b w:val="0"/>
           <w:i w:val="0"/>
         </w:rPr>
-        <w:t>Results: Journal identity explained 26.5% (95% CI 24.7%–28.3%) of the variance of log acceptance time. Journal-specific forecasts lowered loss by 15.7% relative to publisher-pooled forecasts, but 80% intervals spanned about five-fold in days and covered 77.0% of later papers (journal average; imprint-level interval for the shortfall −4.2 to −1.1 points). The shortfall was absent under random splitting and in a stationary simulation, but random cohort-level shifts of the size of the journal × year variance reproduced its order of magnitude (−2.8 to −4.9 points). Lognormal, shrinkage and learned forecasters did not beat empirical quantiles. Recalibration and width inflation learned from earlier cohorts over-corrected (+1.9 and +1.1 points). 12.0% of journal-origins accepted at least half of their papers within 72 days and 1.6% at least 80%; forecast probabilities for this event were too extreme (reliability slope 0.91). In Springer Nature journals with Research Square preprints, 95% of received dates were no later than 14 days after the preprint was posted (journal-weighted 82%), compatible with the received date being the submission date; other publishers' dates could not be tested.</w:t>
+        <w:t>Results: Journal identity explained 26.5% (95% CI 24.7%–28.3%) of the variance of log acceptance time. Journal-specific forecasts lowered loss by 15.7% relative to publisher-pooled forecasts, but 80% intervals spanned about five-fold in days and covered 77.0% of later papers (journal average; imprint mean −2.7, t(6) CI −4.2 to −1.1). The shortfall was absent under random splitting and stationary simulation, but random cohort-level shifts with half to full the journal × year variance gave −2.8 to −4.9 points, bracketing the observed value. Lognormal, shrinkage and learned forecasters did not beat empirical quantiles. At three later origins (F0 −1.9), recalibration and width inflation learned from earlier cohorts over-covered (+1.9 and +1.1 points). 12.0% of journal-origins accepted at least half of their papers within 72 days and 1.6% at least 80%; forecast probabilities for this event were too extreme (reliability slope 0.91). In Springer Nature journals with Research Square preprints, 95% of received dates were no later than 14 days after the preprint was posted (journal-weighted 82%), compatible with the received date being the submission date; other publishers' dates could not be tested.</w:t>
       </w:r>
     </w:p>
     <w:p>
@@ -366,7 +366,7 @@
           <w:b w:val="0"/>
           <w:i w:val="0"/>
         </w:rPr>
-        <w:t>The cleaned data comprised 1,737,272 articles; 22.8% were accepted within 72 days. Forensic checks found little heaping of D at multiples of 30 days (ratio 1.00), 1.2% of papers with D ≤ 7 days and an expected weekday pattern. Of 4,222 articles with a Research Square preprint (a self-selected sample), 4,018 were in Springer Nature journals (212 journals): the median received date was 14 days before posting, 95% were received no later than 14 days after posting and 2.6% more than 90 days after (Figure 2). Journals whose medians looked fast (30 journals, 391 articles; median D 70 days) showed the same pattern (93% and 4.6%). The pre-set criterion that at least 70% of articles fall within ±14 days of posting was not met (47%) because these preprints are posted about two weeks after receipt; the criterion was mis-specified, so the other two statistics are post hoc and show compatibility with, not confirmation of, the received date being the original submission date. Weighting journals equally rather than papers, 82% of articles were received no later than 14 days after posting and 8.9% more than 90 days after. The median offset varied with received year (from -22 to -7 days), so the posting lag shifted over time, and a systematic offset of up to 14 days (about 11% of the median D) cannot be excluded at this resolution. For Wiley and Taylor &amp; Francis journals the probe is uninformative (their Research Square preprints are independent postings: median received 79 and 100 days after posting).</w:t>
+        <w:t>The cleaned data comprised 1,737,272 articles; 22.8% were accepted within 72 days. Forensic checks found little heaping of D at multiples of 30 days (ratio 1.00), 1.2% of papers with D ≤ 7 days and an expected weekday pattern. Of 4,222 articles with a Research Square preprint (a self-selected sample), 4,018 were in Springer Nature journals (212 journals): the median received date was 14 days before posting, 95% were received no later than 14 days after posting and 2.6% more than 90 days after (Figure 2). Journals whose medians looked fast (30 journals, 391 articles; median D 70 days) showed a similar paper-weighted pattern (93% and 4.6%; all publishers), although for the 24 Springer Nature journals with fast-looking medians the journal-weighted share within 14 days was 73%. The pre-set criterion that at least 70% of articles fall within ±14 days of posting was not met (47%) because these preprints are posted about two weeks after receipt; the criterion was mis-specified, so the other two statistics are post hoc and show compatibility with, not confirmation of, the received date being the original submission date. Weighting journals equally rather than papers, 82% of articles were received no later than 14 days after posting and 8.9% more than 90 days after. The median offset varied with received year (from -22 to -7 days), so the posting lag shifted over time, and a systematic offset of up to 14 days (about 11% of the median D) cannot be excluded at this resolution. For Wiley and Taylor &amp; Francis journals the probe is uninformative (their Research Square preprints are independent postings: median received 79 and 100 days after posting).</w:t>
       </w:r>
     </w:p>
     <w:p>
@@ -458,7 +458,7 @@
           <w:b w:val="0"/>
           <w:i w:val="0"/>
         </w:rPr>
-        <w:t>The evaluation covered 1,531 journal-origins from 781 journals and 298,469 target papers. Journal-specific forecasts clearly beat the publisher-pooled forecast (F0 − F2 pinball difference -0.0376; imprint-cluster bootstrap CI -0.0419 to -0.0304; skill 15.7%; same sign in 7/7 imprints; imprint t(6) CI -0.0396 to -0.0267). Differences among the journal-specific forecasters were below 2% of loss (Tables 1 and 2). With t-based imprint intervals (6 degrees of freedom) and Holm adjustment over seven contrasts (Table 2), only two findings were robust at the level of the three publishers: the value of journal information (F0 − F2) and the coverage shortfall below. F0 had lower loss than the lognormal F3 and empirical-Bayes F4 in all publishers (journal-mean differences +0.0028 and +0.0025), but the Holm-adjusted imprint-level p was 0.054 and the publisher-level p about 0.2; F6 was marginally better than F0 (-0.0008; Holm p 0.009, publisher-level p 0.07); and F1 − F0 was not distinguishable from zero. We therefore treat the ranking among journal-specific forecasters as suggestive: the differences are below 2% of loss. Additional forecasters tested by an independent reviewer (skew-normal, pooled-shape and blended) and our learned forecaster L were no better than F0 (L − F0 +0.0002, 95% CI -0.0002 to +0.0007). The lognormal forecasters also overstate the chance of acceptance within 72 days.</w:t>
+        <w:t>The evaluation covered 1,531 journal-origins from 781 journals and 298,469 target papers. Journal-specific forecasts clearly beat the publisher-pooled forecast (F0 − F2 pinball difference -0.0376; imprint-cluster bootstrap CI -0.0419 to -0.0304; skill 15.7%; same sign in 7/7 imprints; imprint-mean difference -0.0331, t(6) CI -0.0396 to -0.0267). Differences among the journal-specific forecasters were below 2% of loss (Tables 1 and 2). With t-based imprint intervals (6 degrees of freedom) and Holm adjustment over seven contrasts (Table 2), only one contrast survived Holm adjustment and a publisher-level check: the value of journal information (F0 − F2). The coverage shortfall (below) was negative in all three publishers (unadjusted publisher-level p = 0.024, not part of the Holm family). F0 had lower loss than the lognormal F3 and empirical-Bayes F4 in all publishers (journal-mean differences +0.0028 and +0.0025), but the Holm-adjusted imprint-level p was 0.054 and the publisher-level p about 0.2; F6 was marginally better than F0 (-0.0008; Holm p 0.009, publisher-level p 0.07); and F1 − F0 favoured the 12-month window at journal level (a difference of +0.0008, below 0.5% of loss) but not at imprint level. We therefore treat the ranking among journal-specific forecasters as suggestive: the differences are below 2% of loss. Additional forecasters tested by an independent reviewer (skew-normal, pooled-shape and blended) and our learned forecaster L were no better than F0 (L − F0 +0.0002, 95% CI -0.0002 to +0.0007). The lognormal forecasters also overstate the chance of acceptance within 72 days.</w:t>
       </w:r>
     </w:p>
     <w:p>
@@ -1203,7 +1203,7 @@
                 <w:b/>
                 <w:sz w:val="16"/>
               </w:rPr>
-              <w:t>Imprint t(6) 95% CI</w:t>
+              <w:t>Imprint-mean difference [t(6) 95% CI]</w:t>
             </w:r>
           </w:p>
         </w:tc>
@@ -1309,7 +1309,7 @@
               <w:rPr>
                 <w:sz w:val="16"/>
               </w:rPr>
-              <w:t>[+0.0006, +0.0054]</w:t>
+              <w:t>+0.0030 [+0.0006, +0.0054]</w:t>
             </w:r>
           </w:p>
         </w:tc>
@@ -1413,7 +1413,7 @@
               <w:rPr>
                 <w:sz w:val="16"/>
               </w:rPr>
-              <w:t>[+0.0008, +0.0057]</w:t>
+              <w:t>+0.0032 [+0.0008, +0.0057]</w:t>
             </w:r>
           </w:p>
         </w:tc>
@@ -1517,7 +1517,7 @@
               <w:rPr>
                 <w:sz w:val="16"/>
               </w:rPr>
-              <w:t>[-0.0001, +0.0011]</w:t>
+              <w:t>+0.0005 [-0.0001, +0.0011]</w:t>
             </w:r>
           </w:p>
         </w:tc>
@@ -1621,7 +1621,7 @@
               <w:rPr>
                 <w:sz w:val="16"/>
               </w:rPr>
-              <w:t>[-0.0010, -0.0004]</w:t>
+              <w:t>-0.0007 [-0.0010, -0.0004]</w:t>
             </w:r>
           </w:p>
         </w:tc>
@@ -1725,7 +1725,7 @@
               <w:rPr>
                 <w:sz w:val="16"/>
               </w:rPr>
-              <w:t>[-0.0396, -0.0267]</w:t>
+              <w:t>-0.0331 [-0.0396, -0.0267]</w:t>
             </w:r>
           </w:p>
         </w:tc>
@@ -1829,7 +1829,7 @@
               <w:rPr>
                 <w:sz w:val="16"/>
               </w:rPr>
-              <w:t>[+0.0014, +0.0059]</w:t>
+              <w:t>+0.0037 [+0.0014, +0.0059]</w:t>
             </w:r>
           </w:p>
         </w:tc>
@@ -1933,7 +1933,7 @@
               <w:rPr>
                 <w:sz w:val="16"/>
               </w:rPr>
-              <w:t>[-0.0004, -0.0001]</w:t>
+              <w:t>-0.0002 [-0.0004, -0.0001]</w:t>
             </w:r>
           </w:p>
         </w:tc>
@@ -2108,7 +2108,7 @@
           <w:b w:val="0"/>
           <w:i w:val="0"/>
         </w:rPr>
-        <w:t>Nominal 80% intervals from F0 covered 77.0% of later papers when averaged over journals and 76.4% when averaged over papers; the shortfall of −3.0 points had a journal-cluster CI of −3.5 to −2.6, which widened to −4.2 to −1.1 with a t(6) interval over imprints, and was −3.6 paper-weighted (journal-cluster CI −4.3 to −3.0). Under the pre-specified rule (a CI excluding ±3 points) the verdict on H2 is therefore inconclusive, not negative. The shortfall differed by imprint, from −5.6 points (largest: BioMed Central) to −1.0 points, but was negative in all 7 imprints and in all three publishers. In the rolling panel (7,417 journal-origins, 787 journals) it was −3.4 points at the first origin, −1.4 at its smallest and −2.5 at the last, a U-shaped course with strong autocorrelation between neighbouring origins (lag-1 0.76). The pooled panel shortfall was −2.4 points (moving-block bootstrap CI −2.9 to −1.8; two-way imprint × origin CI −3.4 to −1.3), and the 95% predictive interval for a future origin was −4.0 to −0.8 points (Figure 4). Skill relative to F2 in the panel was 16.2%.</w:t>
+        <w:t>Nominal 80% intervals from F0 covered 77.0% of later papers when averaged over journals and 76.4% when averaged over papers; the shortfall of −3.0 points had a journal-cluster CI of −3.5 to −2.6, the mean over the seven imprints was −2.7 points with a t(6) interval of −4.2 to −1.1 (unadjusted publisher-level p = 0.024 with 2 degrees of freedom), and the paper-weighted shortfall was −3.6 paper-weighted (journal-cluster CI −4.3 to −3.0). The journal-cluster interval already contains the pre-specified −3-point threshold and the imprint-level interval is wider, so under the pre-specified rule the verdict on H2 is inconclusive, not negative. The shortfall differed by imprint, from −5.6 points (largest: BioMed Central) to −1.0 points, but was negative in all 7 imprints and in all three publishers. In the rolling panel (7,417 journal-origins, 787 journals) it was −3.4 points at the first origin, −1.4 at its smallest and −2.5 at the last, a decline followed by a partial rebound, with strong autocorrelation between neighbouring origins (lag-1 0.76). The mean of the ten origin means was −2.4 points (moving-block bootstrap CI −2.9 to −1.8); pooled over journal-origins it was −2.2 points (two-way imprint × origin CI −3.4 to −1.3), and the 95% predictive interval for a future origin was −4.0 to −0.8 points (Figure 4). Skill relative to F2 in the panel was 16.2%.</w:t>
       </w:r>
     </w:p>
     <w:p>
@@ -2120,7 +2120,7 @@
           <w:b w:val="0"/>
           <w:i w:val="0"/>
         </w:rPr>
-        <w:t>Finite-sample error and a stationary process did not explain the shortfall (Figure 5, Table 3): random splitting inside a complete submission cohort gave −0.0 points (CI −0.2 to +0.2), and a simulated world with the observed volume growth, the visibility rule and no drift gave +0.1 points (CI −0.1 to +0.2), against −3.0 observed. Because that simulation assumes stationarity, it can reject finite-sample and growth explanations but cannot identify an alternative. We therefore simulated random cohort-level shifts: with independent N(0, σ²) location shifts of the training and target cohorts and σ² the journal × year variance component from RQ1 (0.032), the simulated shortfall was −4.9 points (CI −5.0 to −4.7), with σ²/2 −2.8 and with 2σ² −8.9 points; with the target shift halved (an oracle information set) it was −1.6 points, close to the −1.5 observed with the complete submission cohort. The observed −3.0 points lies between the σ²/2 and σ² simulations. This is a consistency check, not a test: it depends on σ², which was estimated from the same data, and the simulation does not identify why cohorts differ. Two features of the data were not reproduced. Observed journal-origin shortfalls varied three times as much (SD 8.6 points) as simulated ones (2.8 points), and observed differences between imprints (−5.6 to −1.0 points) were much larger than simulated ones. A journal-specific proxy for σ² correlated 0.36 with the observed journal shortfall (common σ²: 0.16) and was out-of-time unpredictive in the earlier analysis (R² 0.001).</w:t>
+        <w:t>Finite-sample error and a stationary process did not explain the shortfall (Figure 5, Table 3): random splitting inside a complete submission cohort gave −0.0 points (CI −0.2 to +0.2), and a simulated world with the observed volume growth, the visibility rule and no drift gave +0.1 points (CI −0.1 to +0.2), against −3.0 observed. Because that simulation assumes stationarity, it can reject finite-sample and growth explanations but cannot identify an alternative. We therefore simulated random cohort-level shifts: with independent N(0, σ²) location shifts of the training and target cohorts and σ² the journal × year variance component from RQ1 (0.032), the simulated shortfall was −4.9 points (CI −5.0 to −4.7), with σ²/2 −2.8 and with 2σ² −8.9 points; with no training-cohort shift and the variance of the target shift halved (an oracle information set; the factor one half is a free choice) it was −1.6 points, close to the −1.5 observed with the complete submission cohort. The observed −3.0 points lies between the σ²/2 and σ² simulations. This is a consistency check, not a test: it depends on σ², which was estimated from the same data, and the simulation does not identify why cohorts differ. Two features of the data were not reproduced. Observed journal-origin shortfalls varied three times as much (SD 8.6 points) as simulated ones (2.8 points), and observed differences between imprints (−5.6 to −1.0 points) were much larger than simulated ones. A journal-specific proxy for σ² correlated 0.36 with the observed journal shortfall (common σ²: 0.16) A separate out-of-time model could not predict journal-level shortfalls from earlier data (R² 0.001).</w:t>
       </w:r>
     </w:p>
     <w:p>
@@ -2132,7 +2132,7 @@
           <w:b w:val="0"/>
           <w:i w:val="0"/>
         </w:rPr>
-        <w:t>Direction and selection checks were consistent with this reading. A backward oracle (F0 trained on the complete cohort submitted after the target) under-covered as much as the forward oracle (origin 2022-01: visible −4.1, forward −2.3, backward −2.5; origin 2023-01: −3.3, −1.4, −1.4), so the residual is not a one-way slowing, and eligibility based on pre-origin data only (789 journals) gave −3.1 points, so requiring 50 target papers did not create the shortfall. Using only recently submitted papers that have already been accepted was far worse (−12.9 points).</w:t>
+        <w:t>Direction and selection checks did not contradict this account. A backward oracle (F0 trained on the complete cohort submitted after the target) under-covered as much as the forward oracle (origin 2022-01: visible −4.1, forward −2.3, backward −2.5; origin 2023-01: −3.3, −1.4, −1.4), so the residual is not a one-way slowing, and eligibility based on pre-origin data only (789 journals) gave −3.1 points, so requiring 50 target papers did not create the shortfall. Using only recently submitted papers that have already been accepted was far worse (−12.9 points).</w:t>
       </w:r>
     </w:p>
     <w:p>
@@ -2600,7 +2600,7 @@
               <w:rPr>
                 <w:sz w:val="16"/>
               </w:rPr>
-              <w:t>Simulated cohort shifts, σ² (oracle information set)</w:t>
+              <w:t>Simulated cohort shifts, σ² (oracle: no training shift, target variance σ²/2)</w:t>
             </w:r>
           </w:p>
         </w:tc>
@@ -2864,7 +2864,7 @@
           <w:b w:val="0"/>
           <w:i w:val="0"/>
         </w:rPr>
-        <w:t>Remedies were evaluated under a strict rule: only earlier cohorts whose targets were complete at the origin were used (Z2; origins October 2023, January 2024 and April 2024). There F0 under-covered by −1.9 points (CI −2.4 to −1.3). Quantile-level recalibration R gave +1.9 points (CI +1.4 to +2.4), constant width inflation V (factor 1.075) +1.1 (+0.6 to +1.6) and the empirical-Bayes F4 +1.3 (+0.8 to +1.9). All three therefore over-corrected, because the maps were learned from early origins at which the shortfall was larger (−3.4 to −2.4 points) than at the evaluation origins (−1.4 to −2.5). Pinball loss relative to F0 changed by -0.0002 for R (CI -0.0005 to +0.0000), +0.0001 for V and +0.0033 for F4; the pooled forecast F2 had near-nominal coverage (−0.0 points) but +0.041 higher loss. A first-pass recalibration whose labels were not restricted to cohorts complete at the origin (the look-ahead variant) had moved 2024–2025 coverage from −2.5 to +1.4 points; because it used information an author would not have, and the 2025 target was censored, we do not treat it as evidence for the remedy. A one-parameter correction learned from earlier cohorts is thus a partial and unstable remedy for average coverage; it is not a recommendation for practice.</w:t>
+        <w:t>Remedies were evaluated under a strict rule: only earlier cohorts whose targets were complete at the origin were used (Z2; origins October 2023, January 2024 and April 2024). There F0 under-covered by −1.9 points (CI −2.4 to −1.3). Quantile-level recalibration R gave +1.9 points (CI +1.4 to +2.4), constant width inflation V (factor 1.075) +1.1 (+0.6 to +1.6) and the empirical-Bayes F4 +1.3 (+0.8 to +1.9). All three therefore over-covered; R and V were learned from early origins at which the shortfall was larger (−3.4 to −2.4 points) than at the evaluation origins (−1.4 to −2.5), which is one plausible reason, and F4 is a wider forecaster without any such map. In absolute terms V reduced the coverage error (1.1 against 1.9 points) while R merely changed its sign. Pinball loss relative to F0 changed by -0.0002 for R (CI -0.0005 to +0.0000), +0.0001 for V and +0.0033 for F4; the pooled forecast F2 had near-nominal coverage (−0.0 points) but +0.041 higher loss. The learned forecaster L reached nominal coverage (−0.0 points) at no loss in the first-pass run, but with the same look-ahead labelling and censored 2025 target, and it was trained on one or two cohorts, so this does not show that a learned remedy works. A first-pass recalibration whose labels were not restricted to cohorts complete at the origin (the look-ahead variant) had moved 2024–2025 coverage from −2.5 to +1.4 points; because it used information an author would not have, and the 2025 target was censored, we do not treat it as evidence for the remedy. A one-parameter correction learned from earlier cohorts is thus a partial and unstable remedy for average coverage; it is not a recommendation for practice.</w:t>
       </w:r>
     </w:p>
     <w:p>
@@ -2904,7 +2904,7 @@
           <w:b w:val="0"/>
           <w:i w:val="0"/>
         </w:rPr>
-        <w:t>The realised share of target papers accepted within 72 days was at least 0.5 in 184 of 1,531 journal-origins (12.0%; journal-cluster CI 9.9%–14.2%), at least 0.8 in 25 (1.6%; 0.9%–2.4%) and at least 0.9 in 7 (0.5%). The 72-day threshold is illustrative of maximum-time criteria; 120 and 180 days gave 48% and 80% of journal-origins reaching 0.5. Excluding batch records, fast-lane journals or low-reference articles, or all of these together, left the share between 9.5% and 12.5%; excluding 75 flagged journals gave 8.9%. A substantial part of this share is therefore due to journals with a fast lane for some article types. Fast journals were commonest, by coarse title-keyword coding (exploratory), among chemistry, materials and physics (28% of 99) and clinical medicine journals (23% of 195), and rare among engineering and computing journals (7% of 68). Forecast probabilities of acceptance within 72 days were too extreme: the reliability slope was 0.91 (95% CI 0.88–0.94; slope 1 is perfect; strict evaluation origins, 2,258 journal-origin pairs). Calibrating event probabilities with a map learned on earlier complete cohorts moved the slope to 0.97 (0.93–1.00) and lowered the Brier score by 0.0004 (CI -0.0006 to -0.0002); the improvements were similar for 120 days (slope 0.93 to 0.98) and smaller for 180 days (0.92 to 0.95). In the single highest forecast bin, 23 journal-origins (19 journals) with forecast at least 0.8 (mean forecast 86%) realised 75%, an observation too small to support a separate conclusion.</w:t>
+        <w:t>The realised share of target papers accepted within 72 days was at least 0.5 in 184 of 1,531 journal-origins (12.0%; journal-cluster CI 9.9%–14.2%), at least 0.8 in 25 (1.6%; 0.9%–2.4%) and at least 0.9 in 7 (0.5%). The 72-day threshold is illustrative of maximum-time criteria; 120 and 180 days gave 48% and 80% of journal-origins reaching 0.5. Excluding batch records, fast-lane journals or low-reference articles, or all of these together, left the share between 9.5% and 12.5%; excluding 75 flagged journals gave 8.9%. Excluding fast-lane or flagged journals removed about a quarter of this share, so fast-lane journals account for part of it, but every variant stayed above the 5% threshold of H4. Fast journals were commonest, by coarse title-keyword coding (exploratory), among chemistry, materials and physics (28% of 99) and clinical medicine journals (23% of 195), and rare among engineering and computing journals (7% of 68). Forecast probabilities of acceptance within 72 days were too extreme: the reliability slope was 0.91 (95% CI 0.88–0.94; slope 1 is perfect; strict evaluation origins, 2,258 journal-origin pairs). Calibrating event probabilities with a map learned on earlier complete cohorts moved the slope to 0.97 (0.93–1.00) and lowered the Brier score by 0.0004 (CI -0.0006 to -0.0002); the improvements were similar for 120 days (slope 0.93 to 0.98) and smaller for 180 days (0.92 to 0.95). In the single highest forecast bin, 23 journal-origins (19 journals) with forecast at least 0.8 (mean forecast 86%) realised 75%, an observation too small to support a separate conclusion.</w:t>
       </w:r>
     </w:p>
     <w:tbl>
@@ -3037,7 +3037,7 @@
           <w:b w:val="0"/>
           <w:i w:val="0"/>
         </w:rPr>
-        <w:t>In a strictly out-of-time model (trained on 2022 targets, tested on 158,735 papers of 2024 in 766 journals), author count, received month and weekday improved pinball loss by 1.0% over the control (95% CI 0.6%–1.4%); journal-demeaned features gave 0.8%. Adding reference count, which is not known before submission, raised the gain to 3.0% (2.3%–3.6%), concentrated in the fast tail (τ = 0.10: 5.8%; τ = 0.90: 0.5%), consistent with reference count identifying short article types rather than anything knowable at submission.</w:t>
+        <w:t>The pre-specified article-level model (random journal-grouped cross-validation, features including reference count) improved loss by 3.2% (95% CI 2.5%–3.9%) over a learner with the journal quantile only, above the 2% threshold of H5. Because reference count is not known before submission, we added a strictly out-of-time model (trained on 2022 targets, tested on 158,735 papers of 2024 in 766 journals), in which author count, received month and weekday improved pinball loss by 1.0% over the control (95% CI 0.6%–1.4%); journal-demeaned features gave 0.8%. Adding reference count, which is not known before submission, raised the gain to 3.0% (2.3%–3.6%), concentrated in the fast tail (τ = 0.10: 5.8%; τ = 0.90: 0.5%), consistent with reference count identifying short article types rather than anything knowable at submission.</w:t>
       </w:r>
     </w:p>
     <w:p>
@@ -4373,7 +4373,7 @@
               <w:rPr>
                 <w:sz w:val="16"/>
               </w:rPr>
-              <w:t>journal mean −3.0; paper-weighted −3.6; imprint t(6) CI [−4.2, −1.1]</w:t>
+              <w:t>journal mean −3.0; paper-weighted −3.6; imprint-mean −2.7, t(6) CI [−4.2, −1.1]</w:t>
             </w:r>
           </w:p>
         </w:tc>
@@ -4566,7 +4566,7 @@
               <w:rPr>
                 <w:sz w:val="16"/>
               </w:rPr>
-              <w:t>Specification-dependent</w:t>
+              <w:t>Not supported as pre-specified (random-split E7); strict out-of-time pre-submission features supported (post hoc)</w:t>
             </w:r>
           </w:p>
         </w:tc>
@@ -4583,7 +4583,7 @@
               <w:rPr>
                 <w:sz w:val="16"/>
               </w:rPr>
-              <w:t>pre-submission features 1.0% (supported); with references 3.0% (not supported)</w:t>
+              <w:t>pre-specified E7 3.2% [2.5%, 3.9%]; strict pre-submission features 1.0%; with references 3.0%</w:t>
             </w:r>
           </w:p>
         </w:tc>
@@ -4706,7 +4706,7 @@
               <w:rPr>
                 <w:sz w:val="16"/>
               </w:rPr>
-              <w:t>Not supported</w:t>
+              <w:t>Supported at journal level (small); not at imprint level</w:t>
             </w:r>
           </w:p>
         </w:tc>
@@ -4723,7 +4723,7 @@
               <w:rPr>
                 <w:sz w:val="16"/>
               </w:rPr>
-              <w:t>F1 − F0 +0.0008; imprint t(6) CI -0.0001 to +0.0011</w:t>
+              <w:t>F1 − F0 +0.0008 [+0.0003, +0.0013], Wilcoxon Holm p 2e-06; imprint t(6) CI -0.0001 to +0.0011</w:t>
             </w:r>
           </w:p>
         </w:tc>
@@ -4916,7 +4916,7 @@
               <w:rPr>
                 <w:sz w:val="16"/>
               </w:rPr>
-              <w:t>Supported (L trained on one or two cohorts, untuned: weak test)</w:t>
+              <w:t>Loss: supported; coverage: L reached nominal in a look-ahead run (not evidence); L trained on one or two cohorts, untuned</w:t>
             </w:r>
           </w:p>
         </w:tc>
@@ -4961,7 +4961,7 @@
           <w:b w:val="0"/>
           <w:i w:val="0"/>
         </w:rPr>
-        <w:t>Three findings stand out. First, a journal's own recent history is informative but modestly so: it cuts forecast loss by about 16% relative to ignoring journal identity within a publisher, yet 69% of the variance lies between articles, so 80% intervals span roughly a five-fold range of days. The variance partition agrees with the earlier finding that most variance lies among articles within a journal [4] on a much larger and more recent dataset, and is not claimed as new. Second, simple forecasts are over-confident by about two to three points of coverage. Finite-sample error and a stationary process with growth and delayed visibility do not account for this, whereas random cohort-to-cohort shifts of the size of the journal × year variance component produce a shortfall of the same order; we read the shortfall as a variance-inflation effect (a forecast that ignores the variance of the next cohort's location is too narrow) but we cannot say why cohorts differ, and the correspondence rests on a variance estimated from the same data. Strictly out-of-time recalibration and width inflation over-corrected, because the shortfall was larger at the early origins than at the evaluation origins, so a simple correction is not a dependable remedy. Third, the simplest estimator was hard to beat: lognormal, shrinkage and learned forecasters did not improve on empirical quantiles of the last 12 months, in line with the left-skewed, heavy-tailed shape of within-journal log durations (median skewness -0.79); but only the value of journal information and the existence of a shortfall were robust when the three publishers are treated as the independent units, so the ranking among journal-specific forecasters should be regarded as suggestive.</w:t>
+        <w:t>Three findings stand out. First, a journal's own recent history is informative but modestly so: it cuts forecast loss by about 16% relative to ignoring journal identity within a publisher, yet 69% of the variance lies between articles, so 80% intervals span roughly a five-fold range of days. The variance partition agrees with the earlier finding that most variance lies among articles within a journal [4] on a much larger and more recent dataset, and is not claimed as new. Second, simple forecasts are over-confident by about two to three points of coverage. Finite-sample error and a stationary process with growth and delayed visibility do not account for this, whereas random cohort-to-cohort shifts of the size of the journal × year variance component produce a shortfall of the same order; the shortfall is compatible with a variance-inflation effect (a forecast that ignores the variance of the next cohort's location is too narrow), but this is a consistency check rather than a causal finding: we cannot say why cohorts differ, the variance was estimated from the same data, and the simulation does not reproduce the spread across journals. Strictly out-of-time recalibration, width inflation and shrinkage all over-covered at the evaluation origins, and the early-origin shortfall from which the corrections were learned was larger, so these simple corrections were not dependable; whether a better-designed remedy exists is untested (see the learned forecaster, below). Third, the simplest estimator was hard to beat: lognormal, shrinkage and learned forecasters did not improve on empirical quantiles of the last 12 months, in line with the left-skewed, heavy-tailed shape of within-journal log durations (median skewness -0.79 across 787 journals); but only the value of journal information passed both Holm adjustment and a publisher-level check, and the shortfall was negative in all three publishers, so the ranking among journal-specific forecasters should be regarded as suggestive.</w:t>
       </w:r>
     </w:p>
     <w:p>
@@ -4985,7 +4985,7 @@
           <w:b w:val="0"/>
           <w:i w:val="0"/>
         </w:rPr>
-        <w:t>The study complements descriptive analyses of publication delay and the planned PubMed-wide model [10, 15, 29] by testing forecasts out of time, across three publishers and all fields, and by showing why single past statistics should be reported as quantiles for explicit cohorts with uncertainty.</w:t>
+        <w:t>The study complements descriptive analyses of publication delay and the planned PubMed-wide model [10, 15, 29] by testing forecasts out of time, across three publishers and the fields they cover, and by showing why single past statistics should be reported as quantiles for explicit cohorts with uncertainty.</w:t>
       </w:r>
     </w:p>
     <w:p>
@@ -5029,7 +5029,7 @@
         <w:spacing w:after="60"/>
       </w:pPr>
       <w:r>
-        <w:t>Inference and design: two confirmatory origins (ten in an exploratory panel), overlapping information sets, and only three independent publishers, so journal-cluster intervals are optimistic and imprint-level t(6) intervals are approximate; at publisher level only the value of journal information and the shortfall were clearly nonzero. Several tests are post hoc or exploratory. The explanation of the shortfall is characterised rather than identified: the cohort-shift simulation depends on a variance component estimated from the same data, the stationary simulation assumes the process it tests, and neither reproduces the observed spread across journals or imprints.</w:t>
+        <w:t>Inference and design: two confirmatory origins (ten in an exploratory panel), overlapping information sets, and only three publishers as the highest-level clusters, so journal-cluster intervals are optimistic and imprint-level t(6) intervals are approximate; at publisher level only the value of journal information passed Holm adjustment, and the shortfall was negative in all three publishers (unadjusted p = 0.024 with 2 degrees of freedom). Several tests are post hoc or exploratory. The explanation of the shortfall is characterised rather than identified: the cohort-shift simulation depends on a variance component estimated from the same data, the stationary simulation assumes the process it tests, and neither reproduces the observed spread across journals or imprints.</w:t>
       </w:r>
     </w:p>
     <w:p>
@@ -5085,7 +5085,7 @@
           <w:b w:val="0"/>
           <w:i w:val="0"/>
         </w:rPr>
-        <w:t>A journal's acceptance times over the last year are a useful but wide, slightly over-confident forecast for its next papers. Simple empirical quantiles were as accurate as more elaborate forecasters, simple recalibration learned from earlier cohorts over-corrected, and 'within 72 days' claims were supported for a minority of journals, with forecast probabilities that were too extreme. Turnaround statistics should be reported as drifting distributions with explicit cohorts and uncertainty.</w:t>
+        <w:t>A journal's acceptance times over the last year are a useful but wide, slightly over-confident forecast for its next papers. Simple empirical quantiles were as accurate as more elaborate forecasters, simple recalibration, width inflation and shrinkage learned from earlier cohorts over-covered, and 'within 72 days' claims were supported for a minority of journal-origins, with forecast probabilities that were too extreme. Turnaround statistics should be reported as drifting distributions with explicit cohorts and uncertainty.</w:t>
       </w:r>
     </w:p>
     <w:p>

</xml_diff>

<commit_message>
Cycle 2: act on reproducibility audit (order-of-events disclosure, README order, deviations C2-13..16, text fixes)
Co-Authored-By: Claude Sonnet 5.5 <noreply@anthropic.com>
Claude-Session: https://claude.ai/code/session_01QHzkZ7jvqQ7qpsTaxao7k1
</commit_message>
<xml_diff>
--- a/reinforced/manuscript/Revised_Manuscript.docx
+++ b/reinforced/manuscript/Revised_Manuscript.docx
@@ -166,7 +166,7 @@
           <w:b w:val="0"/>
           <w:i w:val="0"/>
         </w:rPr>
-        <w:t>The first-cycle protocol (frame, cleaning rules, cohorts, forecasters, metrics, seven contrasts and five hypotheses) was committed to the project's git history before any forecast error was computed; this is a pre-specification by the analyst, not a registered report, and no external time stamp exists. In a second cycle, an independent review identified weaknesses and further experiments were added. Their order is disclosed: the received-date probe, a recalibration experiment and a learned-forecaster experiment were designed in code and run once before their protocol text was written, and the recalibration labels in that run were not restricted to cohorts that were complete at the forecast origin; a second adversarial review found this, and the strict re-analysis (see 'Calibration and its causes') replaces it as the reported result. The dependence, data-quality and calibrated-probability experiments, the follow-up panel, the null/simulation, robustness and article-level experiments and the corrective experiments (Z1–Z6 in the repository protocol) were specified and committed before being run. All amendments, post-hoc analyses and failed or mis-specified thresholds are logged in the repository (deviations D1–D11 and cycle-2 log). Five first-cycle hypotheses (H1–H5) were confirmatory and two (H6–H7) exploratory; results that did not support them are reported.</w:t>
+        <w:t>The first-cycle protocol (frame, cleaning rules, cohorts, forecasters, metrics, seven contrasts and five hypotheses) was committed to the project's git history before any forecast error was computed; this is a pre-specification by the analyst, not a registered report, and no external time stamp exists. In a second cycle, an independent review identified weaknesses and further experiments were added. Their order is disclosed: the recalibration and learned-forecaster experiments were designed in code and run once before their protocol text was written; the received-date probe was started before the protocol text, but its first run returned no data, and the data used here come from a relaunch with edited code after the protocol commit (so it ran at least twice); and the recalibration labels in that run were not restricted to cohorts that were complete at the forecast origin; a second adversarial review found this, and the strict re-analysis (see 'Calibration and its causes') replaces it as the reported result. The dependence, data-quality and calibrated-probability experiments, the follow-up panel, the null/simulation, robustness and article-level experiments and the corrective experiments (Z1–Z6 in the repository protocol) were specified and committed before being run. All amendments, post-hoc analyses and failed or mis-specified thresholds are logged in the repository (deviations D1–D11 and cycle-2 log). Five first-cycle hypotheses (H1–H5) were confirmatory and two (H6–H7) exploratory; results that did not support them are reported.</w:t>
       </w:r>
     </w:p>
     <w:p>
@@ -226,7 +226,7 @@
           <w:b w:val="0"/>
           <w:i w:val="0"/>
         </w:rPr>
-        <w:t>Origins were 1 January 2023 and 1 January 2024 (Figure 1). At an origin the author's information set contains papers that were first online before the origin and already received and accepted. The target cohort comprises all papers received in the following 182 days. A journal-origin was eligible with at least 100 visible papers in the preceding 12 months and 50 target papers. Forecasters of the distribution of ln D were evaluated at 19 quantile levels: F0, empirical quantiles of the last 12 months (Hazen definition [17]); F1, the same over 24 months; F2, publisher-pooled quantiles ignoring journal identity (a deliberately weak baseline that is not a published method and serves only to measure the value of journal information); F3, a lognormal fitted by maximum likelihood; F4, an empirical-Bayes lognormal [18, 19]; F6, exponentially time-decayed empirical quantiles (half-life 182.5 days). Cycle-2 forecasters used earlier cohorts only: R, F0 with quantile levels recalibrated by the empirical distribution of probability integral transform values of earlier target cohorts; V, F0 with the interval half-widths multiplied by one constant chosen on the same earlier cohorts to reach 80% pooled coverage; and L, a gradient-boosted quantile regression [20] on journal-level features (past quantiles, size, trend, volume growth, publisher). In the strict evaluation (Z2) only cohorts whose targets were complete at the origin (cohort start + 91 + 480 days ≤ origin) were used, all durations were capped at 480 days, and origins were October 2023, January 2024 and April 2024.</w:t>
+        <w:t>Origins were 1 January 2023 and 1 January 2024 (Figure 1). At an origin the author's information set contains papers that were first online before the origin and already received and accepted. The target cohort comprises all papers received in the following 182 days. A journal-origin was eligible with at least 100 visible papers in the preceding 12 months and 50 target papers. Forecasters of the distribution of ln D were evaluated at 19 quantile levels: F0, empirical quantiles of the last 12 months (Hazen definition [17]); F1, the same over 24 months; F2, publisher-pooled quantiles ignoring journal identity (a deliberately weak baseline that is not a published method and serves only to measure the value of journal information); F3, a lognormal fitted by maximum likelihood; F4, an empirical-Bayes lognormal [18, 19]; F6, exponentially time-decayed empirical quantiles (half-life 182.5 days). Cycle-2 forecasters used earlier cohorts only: R, F0 with quantile levels recalibrated by the empirical distribution of probability integral transform values of earlier target cohorts; V, F0 with the interval half-widths multiplied by one constant chosen on the same earlier cohorts to reach 80% pooled coverage; and L, a gradient-boosted quantile regression [20] on journal-level features (past quantiles, size, trend, volume growth, publisher). In the strict evaluation only cohorts whose targets were complete at the origin (cohort start + 91 + 480 days ≤ origin) were used, all durations were capped at 480 days, and origins were October 2023, January 2024 and April 2024.</w:t>
       </w:r>
     </w:p>
     <w:p>
@@ -366,7 +366,7 @@
           <w:b w:val="0"/>
           <w:i w:val="0"/>
         </w:rPr>
-        <w:t>The cleaned data comprised 1,737,272 articles; 22.8% were accepted within 72 days. Forensic checks found little heaping of D at multiples of 30 days (ratio 1.00), 1.2% of papers with D ≤ 7 days and an expected weekday pattern. Of 4,222 articles with a Research Square preprint (a self-selected sample), 4,018 were in Springer Nature journals (212 journals): the median received date was 14 days before posting, 95% were received no later than 14 days after posting and 2.6% more than 90 days after (Figure 2). Journals whose medians looked fast (30 journals, 391 articles; median D 70 days) showed a similar paper-weighted pattern (93% and 4.6%; all publishers), although for the 24 Springer Nature journals with fast-looking medians the journal-weighted share within 14 days was 73%. The pre-set criterion that at least 70% of articles fall within ±14 days of posting was not met (47%) because these preprints are posted about two weeks after receipt; the criterion was mis-specified, so the other two statistics are post hoc and show compatibility with, not confirmation of, the received date being the original submission date. Weighting journals equally rather than papers, 82% of articles were received no later than 14 days after posting and 8.9% more than 90 days after. The median offset varied with received year (from -22 to -7 days), so the posting lag shifted over time, and a systematic offset of up to 14 days (about 11% of the median D) cannot be excluded at this resolution. For Wiley and Taylor &amp; Francis journals the probe is uninformative (their Research Square preprints are independent postings: median received 79 and 100 days after posting).</w:t>
+        <w:t>The cleaned data comprised 1,737,272 articles; 22.8% were accepted within 72 days. Forensic checks found little heaping of D at multiples of 30 days (ratio 1.00), 1.2% of papers with D ≤ 7 days and an expected weekday pattern. Of 4,222 articles with a Research Square preprint (a self-selected sample), 4,018 were in Springer Nature journals (212 journals): the median received date was 14 days before posting, 95% were received no later than 14 days after posting and 2.6% more than 90 days after (Figure 2). Journals whose medians looked fast (30 journals, 391 articles; median D 70 days) showed a similar paper-weighted pattern (93% and 4.6%; all publishers), although for the 24 Springer Nature journals with fast-looking medians the journal-weighted share within 14 days was 73%. The pre-set criterion that at least 70% of articles fall within ±14 days of posting was not met (47%) because these preprints are posted about two weeks after receipt; the criterion was mis-specified, so the other two statistics are post hoc and show compatibility with, not confirmation of, the received date being the original submission date. Weighting journals equally rather than papers, 82% of articles were received no later than 14 days after posting and 8.9% more than 90 days after. The median offset varied with received year (2021–2026: from -22 to -7 days), so the posting lag shifted over time, and a systematic offset of up to 14 days (about 11% of the median D) cannot be excluded at this resolution. For Wiley and Taylor &amp; Francis journals the probe is uninformative (their Research Square preprints are independent postings: median received 79 and 100 days after posting).</w:t>
       </w:r>
     </w:p>
     <w:p>
@@ -438,7 +438,7 @@
           <w:b w:val="0"/>
           <w:i w:val="0"/>
         </w:rPr>
-        <w:t>Between-journal differences explained 26.5% of the variance of ln D (95% CI 24.7%–28.3%), journal × year differences 4.4% and residual between-article variation 69.1%. Leaving out one publisher at a time gave journal shares of 24.5%–29.0%; excluding 75 flagged journals gave 26.1%; the article-type variants gave 25.9%–27.4%. Thirty non-frame PubMed journals gave 27.4% (wide CI 17.2%–34.5%).</w:t>
+        <w:t>Between-journal differences explained 26.5% of the variance of ln D (95% CI 24.7%–28.3%), journal × year differences 4.4% and residual between-article variation 69.1%. Leaving out one publisher at a time gave journal shares of 24.5%–29.0%; excluding 75 flagged journals gave 26.1%; the article-type variants gave 25.9%–27.4%. 32 non-frame PubMed journals gave 27.4% (wide CI 17.2%–34.5%).</w:t>
       </w:r>
     </w:p>
     <w:p>
@@ -458,7 +458,7 @@
           <w:b w:val="0"/>
           <w:i w:val="0"/>
         </w:rPr>
-        <w:t>The evaluation covered 1,531 journal-origins from 781 journals and 298,469 target papers. Journal-specific forecasts clearly beat the publisher-pooled forecast (F0 − F2 pinball difference -0.0376; imprint-cluster bootstrap CI -0.0419 to -0.0304; skill 15.7%; same sign in 7/7 imprints; imprint-mean difference -0.0331, t(6) CI -0.0396 to -0.0267). Differences among the journal-specific forecasters were below 2% of loss (Tables 1 and 2). With t-based imprint intervals (6 degrees of freedom) and Holm adjustment over seven contrasts (Table 2), only one contrast survived Holm adjustment and a publisher-level check: the value of journal information (F0 − F2). The coverage shortfall (below) was negative in all three publishers (unadjusted publisher-level p = 0.024, not part of the Holm family). F0 had lower loss than the lognormal F3 and empirical-Bayes F4 in all publishers (journal-mean differences +0.0028 and +0.0025), but the Holm-adjusted imprint-level p was 0.054 and the publisher-level p about 0.2; F6 was marginally better than F0 (-0.0008; Holm p 0.009, publisher-level p 0.07); and F1 − F0 favoured the 12-month window at journal level (a difference of +0.0008, below 0.5% of loss) but not at imprint level. We therefore treat the ranking among journal-specific forecasters as suggestive: the differences are below 2% of loss. Additional forecasters tested by an independent reviewer (skew-normal, pooled-shape and blended) and our learned forecaster L were no better than F0 (L − F0 +0.0002, 95% CI -0.0002 to +0.0007). The lognormal forecasters also overstate the chance of acceptance within 72 days.</w:t>
+        <w:t>The evaluation covered 1,531 journal-origins from 781 journals and 298,469 target papers. Journal-specific forecasts clearly beat the publisher-pooled forecast (F0 − F2 pinball difference -0.0376; imprint-cluster bootstrap CI -0.0419 to -0.0304; skill 15.7%; same sign in 7/7 imprints; imprint-mean difference -0.0331, t(6) CI -0.0396 to -0.0267). Differences among the journal-specific forecasters were below 2% of loss (Tables 1 and 2). With t-based imprint intervals (6 degrees of freedom) and Holm adjustment over seven contrasts (Table 2), only one contrast survived Holm adjustment and a publisher-level check: the value of journal information (F0 − F2). The coverage shortfall (below) was negative in all three publishers (unadjusted publisher-level p = 0.024, not part of the Holm family). F0 had lower loss than the lognormal F3 and empirical-Bayes F4 in all publishers (journal-mean differences +0.0028 and +0.0025), but the Holm-adjusted imprint-level p was 0.054 and the publisher-level p about 0.2; F6 was marginally better than F0 (-0.0008; Holm p 0.009, publisher-level p 0.07); and F1 − F0 favoured the 12-month window at journal level (a difference of +0.0008, below 0.5% of loss) but not at imprint level. We therefore treat the ranking among journal-specific forecasters as suggestive: the differences are below 2% of loss. Additional forecasters tried during review (skew-normal, pooled-shape and blended; exploratory, reported in the repository's review notes rather than as archived scripts) and our learned forecaster L were no better than F0 (L − F0 +0.0002, 95% CI -0.0002 to +0.0007). The lognormal forecasters also overstate the chance of acceptance within 72 days.</w:t>
       </w:r>
     </w:p>
     <w:p>
@@ -2864,7 +2864,7 @@
           <w:b w:val="0"/>
           <w:i w:val="0"/>
         </w:rPr>
-        <w:t>Remedies were evaluated under a strict rule: only earlier cohorts whose targets were complete at the origin were used (Z2; origins October 2023, January 2024 and April 2024). There F0 under-covered by −1.9 points (CI −2.4 to −1.3). Quantile-level recalibration R gave +1.9 points (CI +1.4 to +2.4), constant width inflation V (factor 1.075) +1.1 (+0.6 to +1.6) and the empirical-Bayes F4 +1.3 (+0.8 to +1.9). All three therefore over-covered; R and V were learned from early origins at which the shortfall was larger (−3.4 to −2.4 points) than at the evaluation origins (−1.4 to −2.5), which is one plausible reason, and F4 is a wider forecaster without any such map. In absolute terms V reduced the coverage error (1.1 against 1.9 points) while R merely changed its sign. Pinball loss relative to F0 changed by -0.0002 for R (CI -0.0005 to +0.0000), +0.0001 for V and +0.0033 for F4; the pooled forecast F2 had near-nominal coverage (−0.0 points) but +0.041 higher loss. The learned forecaster L reached nominal coverage (−0.0 points) at no loss in the first-pass run, but with the same look-ahead labelling and censored 2025 target, and it was trained on one or two cohorts, so this does not show that a learned remedy works. A first-pass recalibration whose labels were not restricted to cohorts complete at the origin (the look-ahead variant) had moved 2024–2025 coverage from −2.5 to +1.4 points; because it used information an author would not have, and the 2025 target was censored, we do not treat it as evidence for the remedy. A one-parameter correction learned from earlier cohorts is thus a partial and unstable remedy for average coverage; it is not a recommendation for practice.</w:t>
+        <w:t>Remedies were evaluated under a strict rule: only earlier cohorts whose targets were complete at the origin were used (origins October 2023, January 2024 and April 2024). There F0 under-covered by −1.9 points (CI −2.4 to −1.3). Quantile-level recalibration R gave +1.9 points (CI +1.4 to +2.4), constant width inflation V (factor 1.075) +1.1 (+0.6 to +1.6) and the empirical-Bayes F4 +1.3 (+0.8 to +1.9). All three therefore over-covered; R and V were learned from early origins at which the shortfall was larger (−3.4 to −2.8 points at the three origins used) than at the evaluation origins (−1.4 to −2.5), which is one plausible reason, and F4 is a wider forecaster without any such map. In absolute terms V reduced the coverage error (1.1 against 1.9 points) while R merely changed its sign. Pinball loss relative to F0 changed by -0.0002 for R (CI -0.0005 to +0.0000), +0.0001 for V and +0.0033 for F4; the pooled forecast F2 had near-nominal coverage (−0.0 points) but +0.041 higher loss. The learned forecaster L reached nominal coverage (−0.0 points) at no loss in the first-pass run, but with the same look-ahead labelling and censored 2025 target, and it was trained on one or two cohorts, so this does not show that a learned remedy works. A first-pass recalibration whose labels were not restricted to cohorts complete at the origin (the look-ahead variant) had moved 2024–2025 coverage from −2.5 to +1.4 points; because it used information an author would not have, and the 2025 target was censored, we do not treat it as evidence for the remedy. A one-parameter correction learned from earlier cohorts is thus a partial and unstable remedy for average coverage; it is not a recommendation for practice.</w:t>
       </w:r>
     </w:p>
     <w:p>

</xml_diff>